<commit_message>
Update es-419 STET input doc
TS provided new doc
</commit_message>
<xml_diff>
--- a/backend/stet/data/stet_es-419.docx
+++ b/backend/stet/data/stet_es-419.docx
@@ -2118,7 +2118,21 @@
                 <w:b/>
                 <w:bCs/>
               </w:rPr>
-              <w:t>amor/</w:t>
+              <w:t>a</w:t>
+            </w:r>
+            <w:r>
+              <w:rPr>
+                <w:b/>
+                <w:bCs/>
+              </w:rPr>
+              <w:t>mor</w:t>
+            </w:r>
+            <w:r>
+              <w:rPr>
+                <w:b/>
+                <w:bCs/>
+              </w:rPr>
+              <w:t xml:space="preserve">, </w:t>
             </w:r>
             <w:proofErr w:type="spellStart"/>
             <w:r>
@@ -5720,7 +5734,6 @@
                 <w:lang w:val="es-ES"/>
               </w:rPr>
             </w:pPr>
-            <w:proofErr w:type="spellStart"/>
             <w:r>
               <w:rPr>
                 <w:b/>
@@ -5735,16 +5748,23 @@
                 <w:bCs/>
                 <w:lang w:val="es-ES"/>
               </w:rPr>
-              <w:t>einaventurados</w:t>
-            </w:r>
-            <w:proofErr w:type="spellEnd"/>
-            <w:r>
-              <w:rPr>
-                <w:b/>
-                <w:bCs/>
-                <w:lang w:val="es-ES"/>
-              </w:rPr>
-              <w:t>, bendito, bendijo, bendita, bendecida, benditos, bendecía, alabando, alabado, bendecidas, alabanza</w:t>
+              <w:t>i</w:t>
+            </w:r>
+            <w:r>
+              <w:rPr>
+                <w:b/>
+                <w:bCs/>
+                <w:lang w:val="es-ES"/>
+              </w:rPr>
+              <w:t>e</w:t>
+            </w:r>
+            <w:r>
+              <w:rPr>
+                <w:b/>
+                <w:bCs/>
+                <w:lang w:val="es-ES"/>
+              </w:rPr>
+              <w:t>naventurados, bendito, bendijo, bendita, bendecida, benditos, bendecía, alabando, alabado, bendecidas, alabanza</w:t>
             </w:r>
             <w:r>
               <w:rPr>
@@ -6004,7 +6024,15 @@
                 <w:b/>
                 <w:bCs/>
               </w:rPr>
-              <w:t>Buenas</w:t>
+              <w:t>B</w:t>
+            </w:r>
+            <w:r>
+              <w:rPr>
+                <w:rFonts w:ascii="Aptos" w:hAnsi="Aptos"/>
+                <w:b/>
+                <w:bCs/>
+              </w:rPr>
+              <w:t>uenas</w:t>
             </w:r>
             <w:proofErr w:type="spellEnd"/>
             <w:r>
@@ -6022,7 +6050,15 @@
                 <w:b/>
                 <w:bCs/>
               </w:rPr>
-              <w:t>Nuevas</w:t>
+              <w:t>N</w:t>
+            </w:r>
+            <w:r>
+              <w:rPr>
+                <w:rFonts w:ascii="Aptos" w:hAnsi="Aptos"/>
+                <w:b/>
+                <w:bCs/>
+              </w:rPr>
+              <w:t>uevas</w:t>
             </w:r>
             <w:proofErr w:type="spellEnd"/>
           </w:p>
@@ -12187,7 +12223,7 @@
                 <w:bCs/>
                 <w:lang w:val="es-MX"/>
               </w:rPr>
-              <w:t xml:space="preserve">avergonzaron, trataron de manarera vergonzosa, deshonran, deshonra, deshonrados, deshonras, uso diario, deshonra, </w:t>
+              <w:t xml:space="preserve">avergonzaron, trataron de manera vergonzosa, deshonran, deshonra, deshonrados, deshonras, uso diario, deshonra, </w:t>
             </w:r>
             <w:r>
               <w:rPr>
@@ -13042,23 +13078,29 @@
               </w:rPr>
               <w:t xml:space="preserve">enseña, </w:t>
             </w:r>
-            <w:proofErr w:type="spellStart"/>
-            <w:r>
-              <w:rPr>
-                <w:b/>
-                <w:bCs/>
-                <w:lang w:val="es-ES"/>
-              </w:rPr>
-              <w:t>entranamiento</w:t>
-            </w:r>
-            <w:proofErr w:type="spellEnd"/>
-            <w:r>
-              <w:rPr>
-                <w:b/>
-                <w:bCs/>
-                <w:lang w:val="es-ES"/>
-              </w:rPr>
-              <w:t xml:space="preserve">, disciplinaron, </w:t>
+            <w:r>
+              <w:rPr>
+                <w:b/>
+                <w:bCs/>
+                <w:lang w:val="es-ES"/>
+              </w:rPr>
+              <w:t>entr</w:t>
+            </w:r>
+            <w:r>
+              <w:rPr>
+                <w:b/>
+                <w:bCs/>
+                <w:lang w:val="es-ES"/>
+              </w:rPr>
+              <w:t>e</w:t>
+            </w:r>
+            <w:r>
+              <w:rPr>
+                <w:b/>
+                <w:bCs/>
+                <w:lang w:val="es-ES"/>
+              </w:rPr>
+              <w:t xml:space="preserve">namiento, disciplinaron, </w:t>
             </w:r>
             <w:r>
               <w:rPr>
@@ -13547,7 +13589,25 @@
                 <w:bCs/>
                 <w:lang w:val="es-MX"/>
               </w:rPr>
-              <w:t>scogidos, escogido, elegidos, esco</w:t>
+              <w:t xml:space="preserve">scogidos, </w:t>
+            </w:r>
+            <w:r>
+              <w:rPr>
+                <w:rFonts w:ascii="Aptos" w:hAnsi="Aptos"/>
+                <w:b/>
+                <w:bCs/>
+                <w:lang w:val="es-MX"/>
+              </w:rPr>
+              <w:t xml:space="preserve">escogidas, </w:t>
+            </w:r>
+            <w:r>
+              <w:rPr>
+                <w:rFonts w:ascii="Aptos" w:hAnsi="Aptos"/>
+                <w:b/>
+                <w:bCs/>
+                <w:lang w:val="es-MX"/>
+              </w:rPr>
+              <w:t>escogido, elegidos, esco</w:t>
             </w:r>
             <w:r>
               <w:rPr>
@@ -13969,14 +14029,7 @@
                 <w:b/>
                 <w:bCs/>
               </w:rPr>
-              <w:t>e</w:t>
-            </w:r>
-            <w:r>
-              <w:rPr>
-                <w:b/>
-                <w:bCs/>
-              </w:rPr>
-              <w:t>speranza</w:t>
+              <w:t>esperanza</w:t>
             </w:r>
             <w:proofErr w:type="spellEnd"/>
             <w:r>
@@ -13984,7 +14037,7 @@
                 <w:b/>
                 <w:bCs/>
               </w:rPr>
-              <w:t>/</w:t>
+              <w:t xml:space="preserve">, </w:t>
             </w:r>
             <w:proofErr w:type="spellStart"/>
             <w:r>
@@ -16078,7 +16131,25 @@
                 <w:bCs/>
                 <w:lang w:val="es-MX"/>
               </w:rPr>
-              <w:t>loria, glorificando, gloriosa, glorifíca, alabando, glorficados, gloroiso</w:t>
+              <w:t xml:space="preserve">loria, glorificando, gloriosa, </w:t>
+            </w:r>
+            <w:r>
+              <w:rPr>
+                <w:rFonts w:ascii="Aptos" w:hAnsi="Aptos"/>
+                <w:b/>
+                <w:bCs/>
+                <w:lang w:val="es-MX"/>
+              </w:rPr>
+              <w:t xml:space="preserve">glorioso, </w:t>
+            </w:r>
+            <w:r>
+              <w:rPr>
+                <w:rFonts w:ascii="Aptos" w:hAnsi="Aptos"/>
+                <w:b/>
+                <w:bCs/>
+                <w:lang w:val="es-MX"/>
+              </w:rPr>
+              <w:t>glorifíca, alabando, glorficados, gloroiso</w:t>
             </w:r>
             <w:r>
               <w:rPr>
@@ -21222,7 +21293,15 @@
                 <w:bCs/>
                 <w:lang w:val="es-ES"/>
               </w:rPr>
-              <w:t>Juicio, justa, justos, justo, justicia, recto</w:t>
+              <w:t>j</w:t>
+            </w:r>
+            <w:r>
+              <w:rPr>
+                <w:b/>
+                <w:bCs/>
+                <w:lang w:val="es-ES"/>
+              </w:rPr>
+              <w:t>uicio, justa, justos, justo, justicia, recto</w:t>
             </w:r>
           </w:p>
         </w:tc>
@@ -23844,18 +23923,16 @@
                 <w:bCs/>
                 <w:lang w:val="es-ES"/>
               </w:rPr>
-              <w:t xml:space="preserve">obedece, obediencia, </w:t>
-            </w:r>
-            <w:proofErr w:type="spellStart"/>
-            <w:r>
-              <w:rPr>
-                <w:b/>
-                <w:bCs/>
-                <w:lang w:val="es-ES"/>
-              </w:rPr>
-              <w:t>obedeciò</w:t>
-            </w:r>
-            <w:proofErr w:type="spellEnd"/>
+              <w:t>obedece, obediencia, obedeci</w:t>
+            </w:r>
+            <w:r>
+              <w:rPr>
+                <w:b/>
+                <w:bCs/>
+                <w:lang w:val="es-ES"/>
+              </w:rPr>
+              <w:t>ó</w:t>
+            </w:r>
           </w:p>
         </w:tc>
       </w:tr>
@@ -27110,7 +27187,25 @@
                 <w:bCs/>
                 <w:lang w:val="es-MX"/>
               </w:rPr>
-              <w:t>lan determinado, predestinó, conocía, concimiento, elegido</w:t>
+              <w:t>lan determinado, predestinó, conocía, con</w:t>
+            </w:r>
+            <w:r>
+              <w:rPr>
+                <w:rFonts w:ascii="Aptos" w:hAnsi="Aptos"/>
+                <w:b/>
+                <w:bCs/>
+                <w:lang w:val="es-MX"/>
+              </w:rPr>
+              <w:t>o</w:t>
+            </w:r>
+            <w:r>
+              <w:rPr>
+                <w:rFonts w:ascii="Aptos" w:hAnsi="Aptos"/>
+                <w:b/>
+                <w:bCs/>
+                <w:lang w:val="es-MX"/>
+              </w:rPr>
+              <w:t>cimiento, elegido</w:t>
             </w:r>
           </w:p>
         </w:tc>
@@ -27389,6 +27484,14 @@
               </w:rPr>
               <w:t>rofetizamos, profetizaron, profetizó, profetiza, profetizarán, profecía, profecías, profetas, profecía</w:t>
             </w:r>
+            <w:r>
+              <w:rPr>
+                <w:b/>
+                <w:bCs/>
+                <w:lang w:val="es-ES"/>
+              </w:rPr>
+              <w:t>, profetizar</w:t>
+            </w:r>
           </w:p>
         </w:tc>
       </w:tr>
@@ -28823,6 +28926,14 @@
               </w:rPr>
               <w:t>esurrección</w:t>
             </w:r>
+            <w:r>
+              <w:rPr>
+                <w:b/>
+                <w:bCs/>
+                <w:lang w:val="es-MX"/>
+              </w:rPr>
+              <w:t>, resurección</w:t>
+            </w:r>
           </w:p>
         </w:tc>
       </w:tr>
@@ -29611,6 +29722,14 @@
                 <w:lang w:val="es-MX"/>
               </w:rPr>
               <w:t>sabios</w:t>
+            </w:r>
+            <w:r>
+              <w:rPr>
+                <w:b/>
+                <w:bCs/>
+                <w:lang w:val="es-MX"/>
+              </w:rPr>
+              <w:t>, sabia</w:t>
             </w:r>
           </w:p>
         </w:tc>

</xml_diff>